<commit_message>
Update to version 1.14.3: CD900번대 상태 코드를 DB 기반 동적 관리로 변경
</commit_message>
<xml_diff>
--- a/MSYS_Function_Manual_v8.docx
+++ b/MSYS_Function_Manual_v8.docx
@@ -342,6 +342,10 @@
           <w:p>
             <w:r>
               <w:t>대시보드 요약 데이터 조회 - 지정된 기간과 Job에 대한 수집 통계 계산</w:t>
+              <w:br/>
+              <w:t>입력: start_date="2025-12-01", end_date="2025-12-31", all_data=False, job_ids=["CD101", "CD102"]</w:t>
+              <w:br/>
+              <w:t>출력: [{"job_id": "CD101", "cd_nm": "기상청 예보 데이터", "total_count": 45, "overall_success_count": 40, "overall_fail_count": 3, "overall_no_data_count": 2, "week_success": 12, "month_success": 35, "day_success": 2, "day_fail_count": 0, "day_ing_count": 1, "day_no_data_count": 0, "day_total_scheduled": 3, "fail_streak": 0, "settings": {...}}]</w:t>
             </w:r>
           </w:p>
         </w:tc>
@@ -390,6 +394,10 @@
           <w:p>
             <w:r>
               <w:t>원본 수집 데이터 조회 - 필터링된 수집 이력 데이터 반환</w:t>
+              <w:br/>
+              <w:t>입력: start_date="2025-12-01", end_date="2025-12-31", job_ids=["CD101"], all_data=False</w:t>
+              <w:br/>
+              <w:t>출력: [{"job_id": "CD101", "con_id": "CON001", "status": "CD901", "start_dt": "2025-12-18T14:30:15+09", "end_dt": "2025-12-18T14:35:22+09", "rqs_info": "총 요청 수: 10, 실패: 0"}]</w:t>
             </w:r>
           </w:p>
         </w:tc>
@@ -438,6 +446,10 @@
           <w:p>
             <w:r>
               <w:t>성공률 추이 데이터 조회 - 시간별 성공률 변화 추이 계산</w:t>
+              <w:br/>
+              <w:t>입력: start_date="2025-12-01", end_date="2025-12-31", job_ids=["CD101"]</w:t>
+              <w:br/>
+              <w:t>출력: [{"date": "2025-12-18", "job_id": "CD101", "success_rate": 95.2, "total_count": 20, "success_count": 19}]</w:t>
             </w:r>
           </w:p>
         </w:tc>
@@ -486,6 +498,10 @@
           <w:p>
             <w:r>
               <w:t>장애 코드별 문제 데이터 조회 - 오류 유형별 발생 현황 분석</w:t>
+              <w:br/>
+              <w:t>입력: start_date="2025-12-01", end_date="2025-12-31", job_ids=["CD101"]</w:t>
+              <w:br/>
+              <w:t>출력: [{"status": "CD902", "count": 3, "job_id": "CD101", "error_message": "Connection timeout"}]</w:t>
             </w:r>
           </w:p>
         </w:tc>
@@ -534,6 +550,10 @@
           <w:p>
             <w:r>
               <w:t>이벤트 로그 조회 - 시스템 이벤트 및 변경 이력 확인</w:t>
+              <w:br/>
+              <w:t>입력: start_date="2025-12-01", end_date="2025-12-31", all_data=False, allowed_job_ids=["CD101"]</w:t>
+              <w:br/>
+              <w:t>출력: [{"con_id": "CON001", "job_id": "CD101", "status": "CD901", "start_dt": "2025-12-18T14:30:15+09", "end_dt": "2025-12-18T14:35:22+09", "rqs_info": "총 요청 수: 10, 실패: 0"}]</w:t>
             </w:r>
           </w:p>
         </w:tc>
@@ -582,6 +602,10 @@
           <w:p>
             <w:r>
               <w:t>일별 Job 카운트 조회 - Job별 일간 실행 통계 집계</w:t>
+              <w:br/>
+              <w:t>입력: job_id="CD101", start_date="2025-12-01", end_date="2025-12-31", all_data=False, job_ids=["CD101"]</w:t>
+              <w:br/>
+              <w:t>출력: [{"date": "2025-12-18", "job_id": "CD101", "success_count": 2, "fail_count": 0, "total_count": 2}]</w:t>
             </w:r>
           </w:p>
         </w:tc>
@@ -630,6 +654,10 @@
           <w:p>
             <w:r>
               <w:t>이벤트 로그 저장 - 수집 이벤트 정보 기록</w:t>
+              <w:br/>
+              <w:t>입력: con_id="CON001", job_id="CD101", status="CD901", rqs_info="총 요청 수: 10, 실패: 0"</w:t>
+              <w:br/>
+              <w:t>출력: None (DB 저장 완료)</w:t>
             </w:r>
           </w:p>
         </w:tc>
@@ -678,6 +706,120 @@
           <w:p>
             <w:r>
               <w:t>고유 Job ID 목록 조회 - 중복 제거된 Job ID 리스트 반환</w:t>
+              <w:br/>
+              <w:t>입력: job_ids=["CD101", "CD102"]</w:t>
+              <w:br/>
+              <w:t>출력: ["CD101", "CD102"]</w:t>
+            </w:r>
+          </w:p>
+        </w:tc>
+      </w:tr>
+      <w:tr>
+        <w:tc>
+          <w:tcPr>
+            <w:tcW w:type="dxa" w:w="1728"/>
+          </w:tcPr>
+          <w:p>
+            <w:r>
+              <w:t>DAO</w:t>
+            </w:r>
+          </w:p>
+        </w:tc>
+        <w:tc>
+          <w:tcPr>
+            <w:tcW w:type="dxa" w:w="1728"/>
+          </w:tcPr>
+          <w:p>
+            <w:r>
+              <w:t>mapper/dashboard_mapper.py</w:t>
+              <w:br/>
+              <w:t>sql/dashboard/get_event_log.sql</w:t>
+            </w:r>
+          </w:p>
+        </w:tc>
+        <w:tc>
+          <w:tcPr>
+            <w:tcW w:type="dxa" w:w="1728"/>
+          </w:tcPr>
+          <w:p>
+            <w:r>
+              <w:t>get_event_log(start_date, end_date, all_data, allowed_job_ids)</w:t>
+            </w:r>
+          </w:p>
+        </w:tc>
+        <w:tc>
+          <w:tcPr>
+            <w:tcW w:type="dxa" w:w="1728"/>
+          </w:tcPr>
+          <w:p>
+            <w:r>
+              <w:t>중</w:t>
+            </w:r>
+          </w:p>
+        </w:tc>
+        <w:tc>
+          <w:tcPr>
+            <w:tcW w:type="dxa" w:w="1728"/>
+          </w:tcPr>
+          <w:p>
+            <w:r>
+              <w:t>이벤트 로그 조회 - TB_CON_HIST_EVNT_LOG에서 JSON 데이터 추출 및 변환</w:t>
+            </w:r>
+          </w:p>
+        </w:tc>
+      </w:tr>
+      <w:tr>
+        <w:tc>
+          <w:tcPr>
+            <w:tcW w:type="dxa" w:w="1728"/>
+          </w:tcPr>
+          <w:p>
+            <w:r>
+              <w:t>JS</w:t>
+            </w:r>
+          </w:p>
+        </w:tc>
+        <w:tc>
+          <w:tcPr>
+            <w:tcW w:type="dxa" w:w="1728"/>
+          </w:tcPr>
+          <w:p>
+            <w:r>
+              <w:t>static/js/modules/dashboard/eventLog.js</w:t>
+            </w:r>
+          </w:p>
+        </w:tc>
+        <w:tc>
+          <w:tcPr>
+            <w:tcW w:type="dxa" w:w="1728"/>
+          </w:tcPr>
+          <w:p>
+            <w:r>
+              <w:t>renderEventLogToasts()</w:t>
+              <w:br/>
+              <w:t>loadEventLogPage()</w:t>
+              <w:br/>
+              <w:t>filterEventLogData()</w:t>
+            </w:r>
+          </w:p>
+        </w:tc>
+        <w:tc>
+          <w:tcPr>
+            <w:tcW w:type="dxa" w:w="1728"/>
+          </w:tcPr>
+          <w:p>
+            <w:r>
+              <w:t>중</w:t>
+            </w:r>
+          </w:p>
+        </w:tc>
+        <w:tc>
+          <w:tcPr>
+            <w:tcW w:type="dxa" w:w="1728"/>
+          </w:tcPr>
+          <w:p>
+            <w:r>
+              <w:t>이벤트 로그 렌더링 - 상태별 아이콘, 시간 포맷팅, 검색 필터링</w:t>
             </w:r>
           </w:p>
         </w:tc>
@@ -1417,6 +1559,117 @@
       </w:r>
       <w:r>
         <w:t>• HTML: {{ user.is_admin }} = true, {{ current_date }} = '2025-12-18'</w:t>
+        <w:br/>
+        <w:br/>
+      </w:r>
+    </w:p>
+    <w:p>
+      <w:pPr>
+        <w:pStyle w:val="FuncH3"/>
+      </w:pPr>
+      <w:r>
+        <w:t>이벤트 로그 데이터 상세 분석:</w:t>
+      </w:r>
+    </w:p>
+    <w:p>
+      <w:r>
+        <w:t>이벤트 로그는 TB_CON_HIST_EVNT_LOG 테이블에서 JSON 형태의 데이터를 추출하여 표시합니다.</w:t>
+        <w:br/>
+        <w:br/>
+      </w:r>
+      <w:r>
+        <w:rPr>
+          <w:b/>
+        </w:rPr>
+        <w:t>SQL 쿼리 분석 (sql/dashboard/get_event_log.sql):</w:t>
+        <w:br/>
+      </w:r>
+      <w:r>
+        <w:t>SELECT</w:t>
+        <w:br/>
+      </w:r>
+      <w:r>
+        <w:t xml:space="preserve">    (EVNT_CHG_ROW -&gt;&gt; 'con_id')::text AS con_id,</w:t>
+        <w:br/>
+      </w:r>
+      <w:r>
+        <w:t xml:space="preserve">    EVNT_OCCR_TIME AS start_dt,</w:t>
+        <w:br/>
+      </w:r>
+      <w:r>
+        <w:t xml:space="preserve">    (EVNT_CHG_ROW -&gt;&gt; 'end_dt')::timestamptz AS end_dt,</w:t>
+        <w:br/>
+      </w:r>
+      <w:r>
+        <w:t xml:space="preserve">    (EVNT_CHG_ROW -&gt;&gt; 'job_id')::text AS job_id,</w:t>
+        <w:br/>
+      </w:r>
+      <w:r>
+        <w:t xml:space="preserve">    (EVNT_CHG_ROW -&gt;&gt; 'rqs_info')::text AS rqs_info,</w:t>
+        <w:br/>
+      </w:r>
+      <w:r>
+        <w:t xml:space="preserve">    (EVNT_CHG_ROW -&gt;&gt; 'status')::text AS status</w:t>
+        <w:br/>
+      </w:r>
+      <w:r>
+        <w:t>FROM TB_CON_HIST_EVNT_LOG</w:t>
+        <w:br/>
+      </w:r>
+      <w:r>
+        <w:t>{where_clause}</w:t>
+        <w:br/>
+      </w:r>
+      <w:r>
+        <w:t>ORDER BY EVNT_OCCR_TIME DESC</w:t>
+        <w:br/>
+        <w:br/>
+      </w:r>
+      <w:r>
+        <w:rPr>
+          <w:b/>
+        </w:rPr>
+        <w:t>JavaScript 렌더링 로직 (static/js/modules/dashboard/eventLog.js):</w:t>
+        <w:br/>
+      </w:r>
+      <w:r>
+        <w:t>• renderEventLogToasts(): 이벤트 로그를 그리드 형태로 표시</w:t>
+        <w:br/>
+      </w:r>
+      <w:r>
+        <w:t>• formatDurationHr(): 수집 시간 계산 (시작~종료 시간)</w:t>
+        <w:br/>
+      </w:r>
+      <w:r>
+        <w:t>• filterEventLogData(): 검색어 기반 필터링</w:t>
+        <w:br/>
+      </w:r>
+      <w:r>
+        <w:t>• 상태별 아이콘 매핑: CD901(🟢), CD902(🔴), CD903(🟠), CD904(🔵)</w:t>
+        <w:br/>
+        <w:br/>
+      </w:r>
+      <w:r>
+        <w:rPr>
+          <w:b/>
+        </w:rPr>
+        <w:t>실제 입력/출력 예시:</w:t>
+        <w:br/>
+      </w:r>
+      <w:r>
+        <w:t>• 함수 입력: get_event_log(start_date='2025-12-01', end_date='2025-12-31', all_data=False, allowed_job_ids=['CD101', 'CD102'])</w:t>
+        <w:br/>
+      </w:r>
+      <w:r>
+        <w:t>• SQL 파라미터: params = ['2025-12-01', '2025-12-31', ['CD101', 'CD102']]</w:t>
+        <w:br/>
+      </w:r>
+      <w:r>
+        <w:t>• SQL 결과: [{'con_id': 'CON001', 'start_dt': '2025-12-18T14:30:15+09', 'job_id': 'CD101', 'status': 'CD901', 'rqs_info': '총 요청 수: 10, 실패: 0'}, ...]</w:t>
+        <w:br/>
+      </w:r>
+      <w:r>
+        <w:t>• JavaScript 렌더링: 시간(2025-12-18 14:30:15), 아이콘(🟢), Job ID(CD101), 상태(정상 수집), 수집 건수(10/10), 성공률(100%), 수집 시간(수집시간: 0.5hr)</w:t>
         <w:br/>
         <w:br/>
       </w:r>

</xml_diff>